<commit_message>
refactor: Add github issues to the tools section
</commit_message>
<xml_diff>
--- a/docs/Specyfikacja_Organizacja_i_infrastruktura_projektu.docx
+++ b/docs/Specyfikacja_Organizacja_i_infrastruktura_projektu.docx
@@ -70,7 +70,6 @@
           </wp:anchor>
         </w:drawing>
       </w:r>
-      <w:proofErr w:type="spellStart"/>
       <w:r>
         <w:rPr>
           <w:color w:val="FFFFFF" w:themeColor="background1"/>
@@ -80,7 +79,6 @@
         </w:rPr>
         <w:t>CleanTalk</w:t>
       </w:r>
-      <w:proofErr w:type="spellEnd"/>
     </w:p>
     <w:p>
       <w:pPr>
@@ -125,51 +123,15 @@
           <w:szCs w:val="20"/>
           <w:lang w:val="pl-PL"/>
         </w:rPr>
-        <w:t xml:space="preserve">Kamil </w:t>
-      </w:r>
-      <w:proofErr w:type="spellStart"/>
+        <w:t xml:space="preserve">Kamil Raubo 198328 | </w:t>
+      </w:r>
       <w:r>
         <w:rPr>
           <w:color w:val="FFFFFF" w:themeColor="background1"/>
           <w:szCs w:val="20"/>
           <w:lang w:val="pl-PL"/>
         </w:rPr>
-        <w:t>Raubo</w:t>
-      </w:r>
-      <w:proofErr w:type="spellEnd"/>
-      <w:r>
-        <w:rPr>
-          <w:color w:val="FFFFFF" w:themeColor="background1"/>
-          <w:szCs w:val="20"/>
-          <w:lang w:val="pl-PL"/>
-        </w:rPr>
-        <w:t xml:space="preserve"> 198328 | </w:t>
-      </w:r>
-      <w:r>
-        <w:rPr>
-          <w:color w:val="FFFFFF" w:themeColor="background1"/>
-          <w:szCs w:val="20"/>
-          <w:lang w:val="pl-PL"/>
-        </w:rPr>
-        <w:t xml:space="preserve">Bartosz </w:t>
-      </w:r>
-      <w:proofErr w:type="spellStart"/>
-      <w:r>
-        <w:rPr>
-          <w:color w:val="FFFFFF" w:themeColor="background1"/>
-          <w:szCs w:val="20"/>
-          <w:lang w:val="pl-PL"/>
-        </w:rPr>
-        <w:t>Skorowski</w:t>
-      </w:r>
-      <w:proofErr w:type="spellEnd"/>
-      <w:r>
-        <w:rPr>
-          <w:color w:val="FFFFFF" w:themeColor="background1"/>
-          <w:szCs w:val="20"/>
-          <w:lang w:val="pl-PL"/>
-        </w:rPr>
-        <w:t xml:space="preserve"> 197757 | Jakub Bot 197839                            </w:t>
+        <w:t xml:space="preserve">Bartosz Skorowski 197757 | Jakub Bot 197839                            </w:t>
       </w:r>
       <w:r>
         <w:rPr>
@@ -1077,14 +1039,12 @@
         </w:rPr>
         <w:t xml:space="preserve">Nazwa produktu: </w:t>
       </w:r>
-      <w:proofErr w:type="spellStart"/>
       <w:r>
         <w:rPr>
           <w:lang w:val="pl-PL"/>
         </w:rPr>
         <w:t>CleanTalk</w:t>
       </w:r>
-      <w:proofErr w:type="spellEnd"/>
     </w:p>
     <w:p>
       <w:pPr>
@@ -1295,55 +1255,7 @@
           <w:b/>
           <w:bCs w:val="0"/>
         </w:rPr>
-        <w:t xml:space="preserve">Cel </w:t>
-      </w:r>
-      <w:proofErr w:type="spellStart"/>
-      <w:r>
-        <w:rPr>
-          <w:b/>
-          <w:bCs w:val="0"/>
-        </w:rPr>
-        <w:t>i</w:t>
-      </w:r>
-      <w:proofErr w:type="spellEnd"/>
-      <w:r>
-        <w:rPr>
-          <w:b/>
-          <w:bCs w:val="0"/>
-        </w:rPr>
-        <w:t xml:space="preserve"> </w:t>
-      </w:r>
-      <w:proofErr w:type="spellStart"/>
-      <w:r>
-        <w:rPr>
-          <w:b/>
-          <w:bCs w:val="0"/>
-        </w:rPr>
-        <w:t>zakres</w:t>
-      </w:r>
-      <w:proofErr w:type="spellEnd"/>
-      <w:r>
-        <w:rPr>
-          <w:b/>
-          <w:bCs w:val="0"/>
-        </w:rPr>
-        <w:t xml:space="preserve"> </w:t>
-      </w:r>
-      <w:proofErr w:type="spellStart"/>
-      <w:r>
-        <w:rPr>
-          <w:b/>
-          <w:bCs w:val="0"/>
-        </w:rPr>
-        <w:t>produktu</w:t>
-      </w:r>
-      <w:proofErr w:type="spellEnd"/>
-      <w:r>
-        <w:rPr>
-          <w:b/>
-          <w:bCs w:val="0"/>
-        </w:rPr>
-        <w:t>:</w:t>
+        <w:t>Cel i zakres produktu:</w:t>
       </w:r>
       <w:r>
         <w:rPr>
@@ -1390,13 +1302,7 @@
         <w:rPr>
           <w:lang w:val="pl-PL"/>
         </w:rPr>
-        <w:t xml:space="preserve"> niepożądanych słów oraz proponowanie bardziej odpowiednich zamienników.</w:t>
-      </w:r>
-      <w:r>
-        <w:rPr>
-          <w:lang w:val="pl-PL"/>
-        </w:rPr>
-        <w:t xml:space="preserve"> </w:t>
+        <w:t xml:space="preserve"> niepożądanych słów oraz proponowanie bardziej odpowiednich zamienników. </w:t>
       </w:r>
       <w:r>
         <w:rPr>
@@ -1651,13 +1557,7 @@
         <w:rPr>
           <w:lang w:val="pl-PL"/>
         </w:rPr>
-        <w:t xml:space="preserve"> na podstawie nagrania lub wypowiedzi</w:t>
-      </w:r>
-      <w:r>
-        <w:rPr>
-          <w:lang w:val="pl-PL"/>
-        </w:rPr>
-        <w:t>,</w:t>
+        <w:t xml:space="preserve"> na podstawie nagrania lub wypowiedzi,</w:t>
       </w:r>
     </w:p>
     <w:p>
@@ -1700,21 +1600,12 @@
           <w:lang w:val="pl-PL"/>
         </w:rPr>
       </w:pPr>
-      <w:proofErr w:type="spellStart"/>
       <w:r>
         <w:rPr>
           <w:b/>
           <w:bCs w:val="0"/>
         </w:rPr>
-        <w:t>Ograniczenia</w:t>
-      </w:r>
-      <w:proofErr w:type="spellEnd"/>
-      <w:r>
-        <w:rPr>
-          <w:b/>
-          <w:bCs w:val="0"/>
-        </w:rPr>
-        <w:t>:</w:t>
+        <w:t>Ograniczenia:</w:t>
       </w:r>
     </w:p>
     <w:p>
@@ -1728,27 +1619,9 @@
           <w:lang w:val="pl-PL"/>
         </w:rPr>
       </w:pPr>
-      <w:proofErr w:type="spellStart"/>
-      <w:r>
-        <w:t>dokładność</w:t>
-      </w:r>
-      <w:proofErr w:type="spellEnd"/>
-      <w:r>
-        <w:t xml:space="preserve"> </w:t>
-      </w:r>
-      <w:proofErr w:type="spellStart"/>
-      <w:r>
-        <w:t>analizy</w:t>
-      </w:r>
-      <w:proofErr w:type="spellEnd"/>
-      <w:r>
-        <w:t xml:space="preserve"> </w:t>
-      </w:r>
-      <w:proofErr w:type="spellStart"/>
-      <w:r>
-        <w:t>językowej</w:t>
-      </w:r>
-      <w:proofErr w:type="spellEnd"/>
+      <w:r>
+        <w:t>dokładność analizy językowej</w:t>
+      </w:r>
       <w:r>
         <w:t>,</w:t>
       </w:r>
@@ -1794,35 +1667,9 @@
           <w:lang w:val="pl-PL"/>
         </w:rPr>
       </w:pPr>
-      <w:proofErr w:type="spellStart"/>
-      <w:r>
-        <w:t>ograniczenia</w:t>
-      </w:r>
-      <w:proofErr w:type="spellEnd"/>
-      <w:r>
-        <w:t xml:space="preserve"> </w:t>
-      </w:r>
-      <w:proofErr w:type="spellStart"/>
-      <w:r>
-        <w:t>technologii</w:t>
-      </w:r>
-      <w:proofErr w:type="spellEnd"/>
-      <w:r>
-        <w:t xml:space="preserve"> </w:t>
-      </w:r>
-      <w:proofErr w:type="spellStart"/>
-      <w:r>
-        <w:t>rozpoznawania</w:t>
-      </w:r>
-      <w:proofErr w:type="spellEnd"/>
-      <w:r>
-        <w:t xml:space="preserve"> </w:t>
-      </w:r>
-      <w:proofErr w:type="spellStart"/>
-      <w:r>
-        <w:t>mowy</w:t>
-      </w:r>
-      <w:proofErr w:type="spellEnd"/>
+      <w:r>
+        <w:t>ograniczenia technologii rozpoznawania mowy</w:t>
+      </w:r>
       <w:r>
         <w:t>,</w:t>
       </w:r>
@@ -1924,16 +1771,8 @@
         <w:rPr>
           <w:lang w:val="pl-PL"/>
         </w:rPr>
-        <w:t xml:space="preserve"> </w:t>
-      </w:r>
-      <w:proofErr w:type="spellStart"/>
-      <w:r>
-        <w:rPr>
-          <w:lang w:val="pl-PL"/>
-        </w:rPr>
-        <w:t>CleanTalk</w:t>
-      </w:r>
-      <w:proofErr w:type="spellEnd"/>
+        <w:t xml:space="preserve"> CleanTalk</w:t>
+      </w:r>
       <w:r>
         <w:rPr>
           <w:lang w:val="pl-PL"/>
@@ -2009,53 +1848,12 @@
           <w:lang w:val="pl-PL"/>
         </w:rPr>
       </w:pPr>
-      <w:proofErr w:type="spellStart"/>
       <w:r>
         <w:rPr>
           <w:b/>
           <w:bCs w:val="0"/>
         </w:rPr>
-        <w:t>Główne</w:t>
-      </w:r>
-      <w:proofErr w:type="spellEnd"/>
-      <w:r>
-        <w:rPr>
-          <w:b/>
-          <w:bCs w:val="0"/>
-        </w:rPr>
-        <w:t xml:space="preserve"> </w:t>
-      </w:r>
-      <w:proofErr w:type="spellStart"/>
-      <w:r>
-        <w:rPr>
-          <w:b/>
-          <w:bCs w:val="0"/>
-        </w:rPr>
-        <w:t>etapy</w:t>
-      </w:r>
-      <w:proofErr w:type="spellEnd"/>
-      <w:r>
-        <w:rPr>
-          <w:b/>
-          <w:bCs w:val="0"/>
-        </w:rPr>
-        <w:t xml:space="preserve"> </w:t>
-      </w:r>
-      <w:proofErr w:type="spellStart"/>
-      <w:r>
-        <w:rPr>
-          <w:b/>
-          <w:bCs w:val="0"/>
-        </w:rPr>
-        <w:t>projektu</w:t>
-      </w:r>
-      <w:proofErr w:type="spellEnd"/>
-      <w:r>
-        <w:rPr>
-          <w:b/>
-          <w:bCs w:val="0"/>
-        </w:rPr>
-        <w:t>:</w:t>
+        <w:t>Główne etapy projektu:</w:t>
       </w:r>
     </w:p>
     <w:p>
@@ -2067,23 +1865,7 @@
         </w:numPr>
       </w:pPr>
       <w:r>
-        <w:t xml:space="preserve">Analiza </w:t>
-      </w:r>
-      <w:proofErr w:type="spellStart"/>
-      <w:r>
-        <w:t>wymagań</w:t>
-      </w:r>
-      <w:proofErr w:type="spellEnd"/>
-      <w:r>
-        <w:t xml:space="preserve"> </w:t>
-      </w:r>
-      <w:proofErr w:type="spellStart"/>
-      <w:r>
-        <w:t>i</w:t>
-      </w:r>
-      <w:proofErr w:type="spellEnd"/>
-      <w:r>
-        <w:t xml:space="preserve"> Research</w:t>
+        <w:t>Analiza wymagań i Research</w:t>
       </w:r>
     </w:p>
     <w:p>
@@ -2145,35 +1927,9 @@
           <w:lang w:val="pl-PL"/>
         </w:rPr>
       </w:pPr>
-      <w:proofErr w:type="spellStart"/>
-      <w:r>
-        <w:t>Implementacja</w:t>
-      </w:r>
-      <w:proofErr w:type="spellEnd"/>
-      <w:r>
-        <w:t xml:space="preserve"> </w:t>
-      </w:r>
-      <w:proofErr w:type="spellStart"/>
-      <w:r>
-        <w:t>i</w:t>
-      </w:r>
-      <w:proofErr w:type="spellEnd"/>
-      <w:r>
-        <w:t xml:space="preserve"> </w:t>
-      </w:r>
-      <w:proofErr w:type="spellStart"/>
-      <w:r>
-        <w:t>rozwój</w:t>
-      </w:r>
-      <w:proofErr w:type="spellEnd"/>
-      <w:r>
-        <w:t xml:space="preserve"> </w:t>
-      </w:r>
-      <w:proofErr w:type="spellStart"/>
-      <w:r>
-        <w:t>aplikacji</w:t>
-      </w:r>
-      <w:proofErr w:type="spellEnd"/>
+      <w:r>
+        <w:t>Implementacja i rozwój aplikacji</w:t>
+      </w:r>
     </w:p>
     <w:p>
       <w:pPr>
@@ -2186,27 +1942,9 @@
           <w:lang w:val="pl-PL"/>
         </w:rPr>
       </w:pPr>
-      <w:proofErr w:type="spellStart"/>
-      <w:r>
-        <w:t>Testowanie</w:t>
-      </w:r>
-      <w:proofErr w:type="spellEnd"/>
-      <w:r>
-        <w:t xml:space="preserve"> </w:t>
-      </w:r>
-      <w:proofErr w:type="spellStart"/>
-      <w:r>
-        <w:t>i</w:t>
-      </w:r>
-      <w:proofErr w:type="spellEnd"/>
-      <w:r>
-        <w:t xml:space="preserve"> </w:t>
-      </w:r>
-      <w:proofErr w:type="spellStart"/>
-      <w:r>
-        <w:t>weryfikacja</w:t>
-      </w:r>
-      <w:proofErr w:type="spellEnd"/>
+      <w:r>
+        <w:t>Testowanie i weryfikacja</w:t>
+      </w:r>
     </w:p>
     <w:p>
       <w:pPr>
@@ -2219,29 +1957,8 @@
           <w:lang w:val="pl-PL"/>
         </w:rPr>
       </w:pPr>
-      <w:proofErr w:type="spellStart"/>
-      <w:r>
-        <w:t>Wdrożenie</w:t>
-      </w:r>
-      <w:proofErr w:type="spellEnd"/>
-      <w:r>
-        <w:t xml:space="preserve"> </w:t>
-      </w:r>
-      <w:proofErr w:type="spellStart"/>
-      <w:r>
-        <w:t>i</w:t>
-      </w:r>
-      <w:proofErr w:type="spellEnd"/>
-      <w:r>
-        <w:t xml:space="preserve"> </w:t>
-      </w:r>
-      <w:proofErr w:type="spellStart"/>
-      <w:r>
-        <w:t>publikacja</w:t>
-      </w:r>
-      <w:proofErr w:type="spellEnd"/>
-      <w:r>
-        <w:t xml:space="preserve"> MVP</w:t>
+      <w:r>
+        <w:t>Wdrożenie i publikacja MVP</w:t>
       </w:r>
     </w:p>
     <w:p>
@@ -2255,44 +1972,10 @@
           <w:lang w:val="pl-PL"/>
         </w:rPr>
       </w:pPr>
-      <w:proofErr w:type="spellStart"/>
-      <w:r>
-        <w:t>Utrzymanie</w:t>
-      </w:r>
-      <w:proofErr w:type="spellEnd"/>
-      <w:r>
-        <w:t xml:space="preserve"> </w:t>
-      </w:r>
-      <w:proofErr w:type="spellStart"/>
-      <w:r>
-        <w:t>i</w:t>
-      </w:r>
-      <w:proofErr w:type="spellEnd"/>
-      <w:r>
-        <w:t xml:space="preserve"> </w:t>
-      </w:r>
-      <w:proofErr w:type="spellStart"/>
-      <w:r>
-        <w:t>rozwój</w:t>
-      </w:r>
-      <w:proofErr w:type="spellEnd"/>
-      <w:r>
-        <w:t xml:space="preserve"> </w:t>
-      </w:r>
-      <w:proofErr w:type="spellStart"/>
-      <w:r>
-        <w:t>wersji</w:t>
-      </w:r>
-      <w:proofErr w:type="spellEnd"/>
-      <w:r>
-        <w:t xml:space="preserve"> </w:t>
-      </w:r>
-      <w:proofErr w:type="spellStart"/>
-      <w:r>
-        <w:t>końcowej</w:t>
+      <w:r>
+        <w:t>Utrzymanie i rozwój wersji końcowej</w:t>
       </w:r>
       <w:bookmarkStart w:id="1" w:name="_Toc224403132"/>
-      <w:proofErr w:type="spellEnd"/>
     </w:p>
     <w:p>
       <w:pPr>
@@ -2701,16 +2384,8 @@
               <w:rPr>
                 <w:lang w:val="pl-PL"/>
               </w:rPr>
-              <w:t xml:space="preserve"> z aplikacji </w:t>
-            </w:r>
-            <w:proofErr w:type="spellStart"/>
-            <w:r>
-              <w:rPr>
-                <w:lang w:val="pl-PL"/>
-              </w:rPr>
-              <w:t>CleanTalk</w:t>
-            </w:r>
-            <w:proofErr w:type="spellEnd"/>
+              <w:t xml:space="preserve"> z aplikacji CleanTalk</w:t>
+            </w:r>
           </w:p>
         </w:tc>
       </w:tr>
@@ -2846,21 +2521,8 @@
                 <w:lang w:val="pl-PL"/>
               </w:rPr>
             </w:pPr>
-            <w:proofErr w:type="spellStart"/>
-            <w:r>
-              <w:t>Osoby</w:t>
-            </w:r>
-            <w:proofErr w:type="spellEnd"/>
-            <w:r>
-              <w:t xml:space="preserve"> </w:t>
-            </w:r>
-            <w:proofErr w:type="spellStart"/>
-            <w:r>
-              <w:t>rozwijające</w:t>
-            </w:r>
-            <w:proofErr w:type="spellEnd"/>
-            <w:r>
-              <w:t xml:space="preserve"> self-development</w:t>
+            <w:r>
+              <w:t>Osoby rozwijające self-development</w:t>
             </w:r>
           </w:p>
         </w:tc>
@@ -3168,172 +2830,100 @@
                 <w:b/>
                 <w:bCs w:val="0"/>
               </w:rPr>
-              <w:t xml:space="preserve">Rola w </w:t>
-            </w:r>
-            <w:proofErr w:type="spellStart"/>
-            <w:r>
+              <w:t>Rola w zespole</w:t>
+            </w:r>
+          </w:p>
+        </w:tc>
+        <w:tc>
+          <w:tcPr>
+            <w:tcW w:w="1798" w:type="dxa"/>
+          </w:tcPr>
+          <w:p>
+            <w:pPr>
+              <w:pStyle w:val="Tekst"/>
+              <w:jc w:val="center"/>
               <w:rPr>
                 <w:b/>
                 <w:bCs w:val="0"/>
-              </w:rPr>
-              <w:t>zespole</w:t>
-            </w:r>
-            <w:proofErr w:type="spellEnd"/>
-          </w:p>
-        </w:tc>
-        <w:tc>
-          <w:tcPr>
-            <w:tcW w:w="1798" w:type="dxa"/>
-          </w:tcPr>
-          <w:p>
-            <w:pPr>
-              <w:pStyle w:val="Tekst"/>
-              <w:jc w:val="center"/>
+                <w:lang w:val="pl-PL"/>
+              </w:rPr>
+            </w:pPr>
+            <w:r>
               <w:rPr>
                 <w:b/>
                 <w:bCs w:val="0"/>
-                <w:lang w:val="pl-PL"/>
-              </w:rPr>
-            </w:pPr>
-            <w:proofErr w:type="spellStart"/>
-            <w:r>
+              </w:rPr>
+              <w:t>Umiejętności / kompetencje</w:t>
+            </w:r>
+          </w:p>
+        </w:tc>
+        <w:tc>
+          <w:tcPr>
+            <w:tcW w:w="1798" w:type="dxa"/>
+          </w:tcPr>
+          <w:p>
+            <w:pPr>
+              <w:pStyle w:val="Tekst"/>
+              <w:jc w:val="center"/>
               <w:rPr>
                 <w:b/>
                 <w:bCs w:val="0"/>
-              </w:rPr>
-              <w:t>Umiejętności</w:t>
-            </w:r>
-            <w:proofErr w:type="spellEnd"/>
+                <w:lang w:val="pl-PL"/>
+              </w:rPr>
+            </w:pPr>
             <w:r>
               <w:rPr>
                 <w:b/>
                 <w:bCs w:val="0"/>
               </w:rPr>
-              <w:t xml:space="preserve"> / </w:t>
-            </w:r>
-            <w:proofErr w:type="spellStart"/>
-            <w:r>
+              <w:t>Obszary odpowiedzialności</w:t>
+            </w:r>
+          </w:p>
+        </w:tc>
+        <w:tc>
+          <w:tcPr>
+            <w:tcW w:w="1799" w:type="dxa"/>
+          </w:tcPr>
+          <w:p>
+            <w:pPr>
+              <w:pStyle w:val="Tekst"/>
+              <w:jc w:val="center"/>
               <w:rPr>
                 <w:b/>
                 <w:bCs w:val="0"/>
-              </w:rPr>
-              <w:t>kompetencje</w:t>
-            </w:r>
-            <w:proofErr w:type="spellEnd"/>
-          </w:p>
-        </w:tc>
-        <w:tc>
-          <w:tcPr>
-            <w:tcW w:w="1798" w:type="dxa"/>
-          </w:tcPr>
-          <w:p>
-            <w:pPr>
-              <w:pStyle w:val="Tekst"/>
-              <w:jc w:val="center"/>
+                <w:lang w:val="pl-PL"/>
+              </w:rPr>
+            </w:pPr>
+            <w:r>
               <w:rPr>
                 <w:b/>
                 <w:bCs w:val="0"/>
-                <w:lang w:val="pl-PL"/>
-              </w:rPr>
-            </w:pPr>
-            <w:proofErr w:type="spellStart"/>
-            <w:r>
+              </w:rPr>
+              <w:t>Tryb pracy</w:t>
+            </w:r>
+          </w:p>
+        </w:tc>
+        <w:tc>
+          <w:tcPr>
+            <w:tcW w:w="1799" w:type="dxa"/>
+          </w:tcPr>
+          <w:p>
+            <w:pPr>
+              <w:pStyle w:val="Tekst"/>
+              <w:jc w:val="center"/>
               <w:rPr>
                 <w:b/>
                 <w:bCs w:val="0"/>
-              </w:rPr>
-              <w:t>Obszary</w:t>
-            </w:r>
-            <w:proofErr w:type="spellEnd"/>
+                <w:lang w:val="pl-PL"/>
+              </w:rPr>
+            </w:pPr>
             <w:r>
               <w:rPr>
                 <w:b/>
                 <w:bCs w:val="0"/>
               </w:rPr>
-              <w:t xml:space="preserve"> </w:t>
-            </w:r>
-            <w:proofErr w:type="spellStart"/>
-            <w:r>
-              <w:rPr>
-                <w:b/>
-                <w:bCs w:val="0"/>
-              </w:rPr>
-              <w:t>odpowiedzialności</w:t>
-            </w:r>
-            <w:proofErr w:type="spellEnd"/>
-          </w:p>
-        </w:tc>
-        <w:tc>
-          <w:tcPr>
-            <w:tcW w:w="1799" w:type="dxa"/>
-          </w:tcPr>
-          <w:p>
-            <w:pPr>
-              <w:pStyle w:val="Tekst"/>
-              <w:jc w:val="center"/>
-              <w:rPr>
-                <w:b/>
-                <w:bCs w:val="0"/>
-                <w:lang w:val="pl-PL"/>
-              </w:rPr>
-            </w:pPr>
-            <w:proofErr w:type="spellStart"/>
-            <w:r>
-              <w:rPr>
-                <w:b/>
-                <w:bCs w:val="0"/>
-              </w:rPr>
-              <w:t>Tryb</w:t>
-            </w:r>
-            <w:proofErr w:type="spellEnd"/>
-            <w:r>
-              <w:rPr>
-                <w:b/>
-                <w:bCs w:val="0"/>
-              </w:rPr>
-              <w:t xml:space="preserve"> </w:t>
-            </w:r>
-            <w:proofErr w:type="spellStart"/>
-            <w:r>
-              <w:rPr>
-                <w:b/>
-                <w:bCs w:val="0"/>
-              </w:rPr>
-              <w:t>pracy</w:t>
-            </w:r>
-            <w:proofErr w:type="spellEnd"/>
-          </w:p>
-        </w:tc>
-        <w:tc>
-          <w:tcPr>
-            <w:tcW w:w="1799" w:type="dxa"/>
-          </w:tcPr>
-          <w:p>
-            <w:pPr>
-              <w:pStyle w:val="Tekst"/>
-              <w:jc w:val="center"/>
-              <w:rPr>
-                <w:b/>
-                <w:bCs w:val="0"/>
-                <w:lang w:val="pl-PL"/>
-              </w:rPr>
-            </w:pPr>
-            <w:r>
-              <w:rPr>
-                <w:b/>
-                <w:bCs w:val="0"/>
-              </w:rPr>
-              <w:t xml:space="preserve">Dane </w:t>
-            </w:r>
-            <w:proofErr w:type="spellStart"/>
-            <w:r>
-              <w:rPr>
-                <w:b/>
-                <w:bCs w:val="0"/>
-              </w:rPr>
-              <w:t>kontaktowe</w:t>
-            </w:r>
-            <w:proofErr w:type="spellEnd"/>
+              <w:t>Dane kontaktowe</w:t>
+            </w:r>
           </w:p>
         </w:tc>
       </w:tr>
@@ -3356,16 +2946,8 @@
               <w:rPr>
                 <w:lang w:val="pl-PL"/>
               </w:rPr>
-              <w:t xml:space="preserve">Kamil </w:t>
-            </w:r>
-            <w:proofErr w:type="spellStart"/>
-            <w:r>
-              <w:rPr>
-                <w:lang w:val="pl-PL"/>
-              </w:rPr>
-              <w:t>Raubo</w:t>
-            </w:r>
-            <w:proofErr w:type="spellEnd"/>
+              <w:t>Kamil Raubo</w:t>
+            </w:r>
           </w:p>
         </w:tc>
         <w:tc>
@@ -3376,11 +2958,9 @@
             <w:pPr>
               <w:pStyle w:val="Tekst"/>
             </w:pPr>
-            <w:proofErr w:type="spellStart"/>
             <w:r>
               <w:t>Kierownik</w:t>
             </w:r>
-            <w:proofErr w:type="spellEnd"/>
           </w:p>
         </w:tc>
         <w:tc>
@@ -3417,21 +2997,7 @@
               <w:rPr>
                 <w:lang w:val="pl-PL"/>
               </w:rPr>
-              <w:t xml:space="preserve">nterfejsu użytkownika, </w:t>
-            </w:r>
-            <w:proofErr w:type="spellStart"/>
-            <w:r>
-              <w:rPr>
-                <w:lang w:val="pl-PL"/>
-              </w:rPr>
-              <w:t>Research</w:t>
-            </w:r>
-            <w:proofErr w:type="spellEnd"/>
-            <w:r>
-              <w:rPr>
-                <w:lang w:val="pl-PL"/>
-              </w:rPr>
-              <w:t xml:space="preserve"> i wdrożenie modeli AI</w:t>
+              <w:t>nterfejsu użytkownika, Research i wdrożenie modeli AI</w:t>
             </w:r>
           </w:p>
         </w:tc>
@@ -3443,11 +3009,9 @@
             <w:pPr>
               <w:pStyle w:val="Tekst"/>
             </w:pPr>
-            <w:proofErr w:type="spellStart"/>
             <w:r>
               <w:t>Zdalnie</w:t>
             </w:r>
-            <w:proofErr w:type="spellEnd"/>
           </w:p>
         </w:tc>
         <w:tc>
@@ -3483,16 +3047,8 @@
               <w:rPr>
                 <w:lang w:val="pl-PL"/>
               </w:rPr>
-              <w:t xml:space="preserve">Bartosz </w:t>
-            </w:r>
-            <w:proofErr w:type="spellStart"/>
-            <w:r>
-              <w:rPr>
-                <w:lang w:val="pl-PL"/>
-              </w:rPr>
-              <w:t>Skorowski</w:t>
-            </w:r>
-            <w:proofErr w:type="spellEnd"/>
+              <w:t>Bartosz Skorowski</w:t>
+            </w:r>
           </w:p>
         </w:tc>
         <w:tc>
@@ -3510,16 +3066,8 @@
               <w:rPr>
                 <w:lang w:val="pl-PL"/>
               </w:rPr>
-              <w:t xml:space="preserve">Software </w:t>
-            </w:r>
-            <w:proofErr w:type="spellStart"/>
-            <w:r>
-              <w:rPr>
-                <w:lang w:val="pl-PL"/>
-              </w:rPr>
-              <w:t>Engineer</w:t>
-            </w:r>
-            <w:proofErr w:type="spellEnd"/>
+              <w:t>Software Engineer</w:t>
+            </w:r>
           </w:p>
         </w:tc>
         <w:tc>
@@ -3533,33 +3081,11 @@
                 <w:lang w:val="pl-PL"/>
               </w:rPr>
             </w:pPr>
-            <w:proofErr w:type="spellStart"/>
-            <w:r>
-              <w:rPr>
-                <w:lang w:val="pl-PL"/>
-              </w:rPr>
-              <w:t>Flutter</w:t>
-            </w:r>
-            <w:proofErr w:type="spellEnd"/>
-            <w:r>
-              <w:rPr>
-                <w:lang w:val="pl-PL"/>
-              </w:rPr>
-              <w:t xml:space="preserve">, </w:t>
-            </w:r>
-            <w:proofErr w:type="spellStart"/>
-            <w:r>
-              <w:rPr>
-                <w:lang w:val="pl-PL"/>
-              </w:rPr>
-              <w:t>Dart</w:t>
-            </w:r>
-            <w:proofErr w:type="spellEnd"/>
-            <w:r>
-              <w:rPr>
-                <w:lang w:val="pl-PL"/>
-              </w:rPr>
-              <w:t>, Testowanie</w:t>
+            <w:r>
+              <w:rPr>
+                <w:lang w:val="pl-PL"/>
+              </w:rPr>
+              <w:t>Flutter, Dart, Testowanie</w:t>
             </w:r>
             <w:r>
               <w:rPr>
@@ -3665,16 +3191,8 @@
               <w:rPr>
                 <w:lang w:val="pl-PL"/>
               </w:rPr>
-              <w:t xml:space="preserve">Software </w:t>
-            </w:r>
-            <w:proofErr w:type="spellStart"/>
-            <w:r>
-              <w:rPr>
-                <w:lang w:val="pl-PL"/>
-              </w:rPr>
-              <w:t>Engineer</w:t>
-            </w:r>
-            <w:proofErr w:type="spellEnd"/>
+              <w:t>Software Engineer</w:t>
+            </w:r>
           </w:p>
         </w:tc>
         <w:tc>
@@ -3688,33 +3206,11 @@
                 <w:lang w:val="pl-PL"/>
               </w:rPr>
             </w:pPr>
-            <w:proofErr w:type="spellStart"/>
-            <w:r>
-              <w:rPr>
-                <w:lang w:val="pl-PL"/>
-              </w:rPr>
-              <w:t>Flutter</w:t>
-            </w:r>
-            <w:proofErr w:type="spellEnd"/>
-            <w:r>
-              <w:rPr>
-                <w:lang w:val="pl-PL"/>
-              </w:rPr>
-              <w:t xml:space="preserve">, </w:t>
-            </w:r>
-            <w:proofErr w:type="spellStart"/>
-            <w:r>
-              <w:rPr>
-                <w:lang w:val="pl-PL"/>
-              </w:rPr>
-              <w:t>Dart</w:t>
-            </w:r>
-            <w:proofErr w:type="spellEnd"/>
-            <w:r>
-              <w:rPr>
-                <w:lang w:val="pl-PL"/>
-              </w:rPr>
-              <w:t>, Testowanie</w:t>
+            <w:r>
+              <w:rPr>
+                <w:lang w:val="pl-PL"/>
+              </w:rPr>
+              <w:t>Flutter, Dart, Testowanie</w:t>
             </w:r>
             <w:r>
               <w:rPr>
@@ -4003,29 +3499,11 @@
                 <w:lang w:val="pl-PL"/>
               </w:rPr>
             </w:pPr>
-            <w:proofErr w:type="spellStart"/>
             <w:r>
               <w:t>Codziennie</w:t>
             </w:r>
-            <w:proofErr w:type="spellEnd"/>
-            <w:r>
-              <w:t xml:space="preserve"> (</w:t>
-            </w:r>
-            <w:proofErr w:type="spellStart"/>
-            <w:r>
-              <w:t>poniedziałek</w:t>
-            </w:r>
-            <w:proofErr w:type="spellEnd"/>
-            <w:r>
-              <w:t xml:space="preserve"> - </w:t>
-            </w:r>
-            <w:proofErr w:type="spellStart"/>
-            <w:r>
-              <w:t>piątek</w:t>
-            </w:r>
-            <w:proofErr w:type="spellEnd"/>
-            <w:r>
-              <w:t>)</w:t>
+            <w:r>
+              <w:t xml:space="preserve"> (poniedziałek - piątek)</w:t>
             </w:r>
             <w:r>
               <w:t>, 1</w:t>
@@ -4055,19 +3533,11 @@
                 <w:lang w:val="pl-PL"/>
               </w:rPr>
             </w:pPr>
-            <w:proofErr w:type="spellStart"/>
-            <w:r>
-              <w:rPr>
-                <w:lang w:val="pl-PL"/>
-              </w:rPr>
-              <w:t>Discord</w:t>
-            </w:r>
-            <w:proofErr w:type="spellEnd"/>
-            <w:r>
-              <w:rPr>
-                <w:lang w:val="pl-PL"/>
-              </w:rPr>
-              <w:t>, Link: XXX</w:t>
+            <w:r>
+              <w:rPr>
+                <w:lang w:val="pl-PL"/>
+              </w:rPr>
+              <w:t>Discord, Link: XXX</w:t>
             </w:r>
           </w:p>
         </w:tc>
@@ -4119,35 +3589,14 @@
                 <w:lang w:val="pl-PL"/>
               </w:rPr>
             </w:pPr>
-            <w:proofErr w:type="spellStart"/>
-            <w:r>
-              <w:t>Początek</w:t>
-            </w:r>
-            <w:proofErr w:type="spellEnd"/>
-            <w:r>
-              <w:t xml:space="preserve"> </w:t>
-            </w:r>
-            <w:proofErr w:type="spellStart"/>
-            <w:r>
-              <w:t>sprintu</w:t>
-            </w:r>
-            <w:proofErr w:type="spellEnd"/>
-            <w:r>
-              <w:t xml:space="preserve"> </w:t>
+            <w:r>
+              <w:t xml:space="preserve">Początek sprintu </w:t>
             </w:r>
             <w:r>
               <w:t>-</w:t>
             </w:r>
             <w:r>
-              <w:t xml:space="preserve"> </w:t>
-            </w:r>
-            <w:proofErr w:type="spellStart"/>
-            <w:r>
-              <w:t>poniedziałek</w:t>
-            </w:r>
-            <w:proofErr w:type="spellEnd"/>
-            <w:r>
-              <w:t>, 17:30</w:t>
+              <w:t xml:space="preserve"> poniedziałek, 17:30</w:t>
             </w:r>
             <w:r>
               <w:t>-</w:t>
@@ -4168,19 +3617,11 @@
                 <w:lang w:val="pl-PL"/>
               </w:rPr>
             </w:pPr>
-            <w:proofErr w:type="spellStart"/>
-            <w:r>
-              <w:rPr>
-                <w:lang w:val="pl-PL"/>
-              </w:rPr>
-              <w:t>Discord</w:t>
-            </w:r>
-            <w:proofErr w:type="spellEnd"/>
-            <w:r>
-              <w:rPr>
-                <w:lang w:val="pl-PL"/>
-              </w:rPr>
-              <w:t>, Link: XXX</w:t>
+            <w:r>
+              <w:rPr>
+                <w:lang w:val="pl-PL"/>
+              </w:rPr>
+              <w:t>Discord, Link: XXX</w:t>
             </w:r>
           </w:p>
         </w:tc>
@@ -4232,35 +3673,14 @@
                 <w:lang w:val="pl-PL"/>
               </w:rPr>
             </w:pPr>
-            <w:proofErr w:type="spellStart"/>
-            <w:r>
-              <w:t>Koniec</w:t>
-            </w:r>
-            <w:proofErr w:type="spellEnd"/>
-            <w:r>
-              <w:t xml:space="preserve"> </w:t>
-            </w:r>
-            <w:proofErr w:type="spellStart"/>
-            <w:r>
-              <w:t>sprintu</w:t>
-            </w:r>
-            <w:proofErr w:type="spellEnd"/>
-            <w:r>
-              <w:t xml:space="preserve"> </w:t>
+            <w:r>
+              <w:t xml:space="preserve">Koniec sprintu </w:t>
             </w:r>
             <w:r>
               <w:t>-</w:t>
             </w:r>
             <w:r>
-              <w:t xml:space="preserve"> </w:t>
-            </w:r>
-            <w:proofErr w:type="spellStart"/>
-            <w:r>
-              <w:t>piątek</w:t>
-            </w:r>
-            <w:proofErr w:type="spellEnd"/>
-            <w:r>
-              <w:t>, 12:</w:t>
+              <w:t xml:space="preserve"> piątek, 12:</w:t>
             </w:r>
             <w:r>
               <w:t>00-</w:t>
@@ -4307,21 +3727,7 @@
               <w:rPr>
                 <w:lang w:val="pl-PL"/>
               </w:rPr>
-              <w:t xml:space="preserve">Prezentacja ukończonych funkcji/interfejsu interesariuszom, zbieranie feedbacku i aktualizacja </w:t>
-            </w:r>
-            <w:proofErr w:type="spellStart"/>
-            <w:r>
-              <w:rPr>
-                <w:lang w:val="pl-PL"/>
-              </w:rPr>
-              <w:t>backlogu</w:t>
-            </w:r>
-            <w:proofErr w:type="spellEnd"/>
-            <w:r>
-              <w:rPr>
-                <w:lang w:val="pl-PL"/>
-              </w:rPr>
-              <w:t>.</w:t>
+              <w:t>Prezentacja ukończonych funkcji/interfejsu interesariuszom, zbieranie feedbacku i aktualizacja backlogu.</w:t>
             </w:r>
           </w:p>
         </w:tc>
@@ -4354,35 +3760,14 @@
                 <w:lang w:val="pl-PL"/>
               </w:rPr>
             </w:pPr>
-            <w:proofErr w:type="spellStart"/>
-            <w:r>
-              <w:t>Koniec</w:t>
-            </w:r>
-            <w:proofErr w:type="spellEnd"/>
-            <w:r>
-              <w:t xml:space="preserve"> </w:t>
-            </w:r>
-            <w:proofErr w:type="spellStart"/>
-            <w:r>
-              <w:t>sprintu</w:t>
-            </w:r>
-            <w:proofErr w:type="spellEnd"/>
-            <w:r>
-              <w:t xml:space="preserve"> </w:t>
+            <w:r>
+              <w:t xml:space="preserve">Koniec sprintu </w:t>
             </w:r>
             <w:r>
               <w:t>-</w:t>
             </w:r>
             <w:r>
-              <w:t xml:space="preserve"> </w:t>
-            </w:r>
-            <w:proofErr w:type="spellStart"/>
-            <w:r>
-              <w:t>piątek</w:t>
-            </w:r>
-            <w:proofErr w:type="spellEnd"/>
-            <w:r>
-              <w:t>, 1</w:t>
+              <w:t xml:space="preserve"> piątek, 1</w:t>
             </w:r>
             <w:r>
               <w:t>3:00</w:t>
@@ -4406,19 +3791,11 @@
                 <w:lang w:val="pl-PL"/>
               </w:rPr>
             </w:pPr>
-            <w:proofErr w:type="spellStart"/>
-            <w:r>
-              <w:rPr>
-                <w:lang w:val="pl-PL"/>
-              </w:rPr>
-              <w:t>Discord</w:t>
-            </w:r>
-            <w:proofErr w:type="spellEnd"/>
-            <w:r>
-              <w:rPr>
-                <w:lang w:val="pl-PL"/>
-              </w:rPr>
-              <w:t>, Link: XXX</w:t>
+            <w:r>
+              <w:rPr>
+                <w:lang w:val="pl-PL"/>
+              </w:rPr>
+              <w:t>Discord, Link: XXX</w:t>
             </w:r>
           </w:p>
         </w:tc>
@@ -4470,21 +3847,8 @@
                 <w:lang w:val="pl-PL"/>
               </w:rPr>
             </w:pPr>
-            <w:proofErr w:type="spellStart"/>
-            <w:r>
-              <w:t>Każda</w:t>
-            </w:r>
-            <w:proofErr w:type="spellEnd"/>
-            <w:r>
-              <w:t xml:space="preserve"> </w:t>
-            </w:r>
-            <w:proofErr w:type="spellStart"/>
-            <w:r>
-              <w:t>środa</w:t>
-            </w:r>
-            <w:proofErr w:type="spellEnd"/>
-            <w:r>
-              <w:t>, 17:30</w:t>
+            <w:r>
+              <w:t>Każda środa, 17:30</w:t>
             </w:r>
             <w:r>
               <w:t>-</w:t>
@@ -4505,19 +3869,11 @@
                 <w:lang w:val="pl-PL"/>
               </w:rPr>
             </w:pPr>
-            <w:proofErr w:type="spellStart"/>
-            <w:r>
-              <w:rPr>
-                <w:lang w:val="pl-PL"/>
-              </w:rPr>
-              <w:t>Discord</w:t>
-            </w:r>
-            <w:proofErr w:type="spellEnd"/>
-            <w:r>
-              <w:rPr>
-                <w:lang w:val="pl-PL"/>
-              </w:rPr>
-              <w:t>, Link: XXX</w:t>
+            <w:r>
+              <w:rPr>
+                <w:lang w:val="pl-PL"/>
+              </w:rPr>
+              <w:t>Discord, Link: XXX</w:t>
             </w:r>
           </w:p>
         </w:tc>
@@ -4532,33 +3888,11 @@
                 <w:lang w:val="pl-PL"/>
               </w:rPr>
             </w:pPr>
-            <w:proofErr w:type="spellStart"/>
-            <w:r>
-              <w:rPr>
-                <w:lang w:val="pl-PL"/>
-              </w:rPr>
-              <w:t>Priorytetyzacja</w:t>
-            </w:r>
-            <w:proofErr w:type="spellEnd"/>
-            <w:r>
-              <w:rPr>
-                <w:lang w:val="pl-PL"/>
-              </w:rPr>
-              <w:t xml:space="preserve"> elementów </w:t>
-            </w:r>
-            <w:proofErr w:type="spellStart"/>
-            <w:r>
-              <w:rPr>
-                <w:lang w:val="pl-PL"/>
-              </w:rPr>
-              <w:t>backlogu</w:t>
-            </w:r>
-            <w:proofErr w:type="spellEnd"/>
-            <w:r>
-              <w:rPr>
-                <w:lang w:val="pl-PL"/>
-              </w:rPr>
-              <w:t>, doprecyzowanie wymagań i kryteriów akceptacji.</w:t>
+            <w:r>
+              <w:rPr>
+                <w:lang w:val="pl-PL"/>
+              </w:rPr>
+              <w:t>Priorytetyzacja elementów backlogu, doprecyzowanie wymagań i kryteriów akceptacji.</w:t>
             </w:r>
           </w:p>
         </w:tc>
@@ -4771,19 +4105,9 @@
             <w:pPr>
               <w:pStyle w:val="Tekst"/>
             </w:pPr>
-            <w:proofErr w:type="spellStart"/>
-            <w:r>
-              <w:t>Kierownik</w:t>
-            </w:r>
-            <w:proofErr w:type="spellEnd"/>
-            <w:r>
-              <w:t xml:space="preserve"> </w:t>
-            </w:r>
-            <w:proofErr w:type="spellStart"/>
-            <w:r>
-              <w:t>projektu</w:t>
-            </w:r>
-            <w:proofErr w:type="spellEnd"/>
+            <w:r>
+              <w:t>Kierownik projektu</w:t>
+            </w:r>
           </w:p>
         </w:tc>
         <w:tc>
@@ -4850,14 +4174,12 @@
                 <w:lang w:val="pl-PL"/>
               </w:rPr>
             </w:pPr>
-            <w:proofErr w:type="spellStart"/>
             <w:r>
               <w:rPr>
                 <w:lang w:val="pl-PL"/>
               </w:rPr>
               <w:t>Reddit</w:t>
             </w:r>
-            <w:proofErr w:type="spellEnd"/>
             <w:r>
               <w:rPr>
                 <w:lang w:val="pl-PL"/>
@@ -4956,16 +4278,8 @@
         <w:rPr>
           <w:lang w:val="pl-PL"/>
         </w:rPr>
-        <w:t xml:space="preserve">Dokumentacja: </w:t>
-      </w:r>
-      <w:proofErr w:type="spellStart"/>
-      <w:r>
-        <w:rPr>
-          <w:lang w:val="pl-PL"/>
-        </w:rPr>
-        <w:t>Github</w:t>
-      </w:r>
-      <w:proofErr w:type="spellEnd"/>
+        <w:t>Dokumentacja: Github</w:t>
+      </w:r>
     </w:p>
     <w:p>
       <w:pPr>
@@ -4982,16 +4296,8 @@
         <w:rPr>
           <w:lang w:val="pl-PL"/>
         </w:rPr>
-        <w:t xml:space="preserve">Kod źródłowy: </w:t>
-      </w:r>
-      <w:proofErr w:type="spellStart"/>
-      <w:r>
-        <w:rPr>
-          <w:lang w:val="pl-PL"/>
-        </w:rPr>
-        <w:t>Github</w:t>
-      </w:r>
-      <w:proofErr w:type="spellEnd"/>
+        <w:t>Kod źródłowy: Github</w:t>
+      </w:r>
     </w:p>
     <w:p>
       <w:pPr>
@@ -5061,7 +4367,6 @@
         </w:rPr>
         <w:t xml:space="preserve">Sposób dostępu: Każdy członek zespołu ma przydzielone konto z rolą </w:t>
       </w:r>
-      <w:proofErr w:type="spellStart"/>
       <w:r>
         <w:rPr>
           <w:bCs w:val="0"/>
@@ -5069,7 +4374,6 @@
         </w:rPr>
         <w:t>collaborator</w:t>
       </w:r>
-      <w:proofErr w:type="spellEnd"/>
       <w:r>
         <w:rPr>
           <w:bCs w:val="0"/>
@@ -5100,16 +4404,8 @@
         <w:rPr>
           <w:lang w:val="pl-PL"/>
         </w:rPr>
-        <w:t xml:space="preserve"> Kamil </w:t>
-      </w:r>
-      <w:proofErr w:type="spellStart"/>
-      <w:r>
-        <w:rPr>
-          <w:lang w:val="pl-PL"/>
-        </w:rPr>
-        <w:t>Raubo</w:t>
-      </w:r>
-      <w:proofErr w:type="spellEnd"/>
+        <w:t xml:space="preserve"> Kamil Raubo</w:t>
+      </w:r>
     </w:p>
     <w:p>
       <w:pPr>
@@ -5133,16 +4429,8 @@
         <w:rPr>
           <w:lang w:val="pl-PL"/>
         </w:rPr>
-        <w:t xml:space="preserve"> Kamil </w:t>
-      </w:r>
-      <w:proofErr w:type="spellStart"/>
-      <w:r>
-        <w:rPr>
-          <w:lang w:val="pl-PL"/>
-        </w:rPr>
-        <w:t>Raubo</w:t>
-      </w:r>
-      <w:proofErr w:type="spellEnd"/>
+        <w:t xml:space="preserve"> Kamil Raubo</w:t>
+      </w:r>
     </w:p>
     <w:p>
       <w:pPr>
@@ -5211,7 +4499,6 @@
           <w:lang w:val="pl-PL"/>
         </w:rPr>
       </w:pPr>
-      <w:proofErr w:type="spellStart"/>
       <w:r>
         <w:rPr>
           <w:lang w:val="pl-PL"/>
@@ -5224,7 +4511,6 @@
         </w:rPr>
         <w:t>.ext</w:t>
       </w:r>
-      <w:proofErr w:type="spellEnd"/>
     </w:p>
     <w:p>
       <w:pPr>
@@ -5323,35 +4609,7 @@
         <w:rPr>
           <w:lang w:val="pl-PL"/>
         </w:rPr>
-        <w:t>.</w:t>
-      </w:r>
-      <w:proofErr w:type="spellStart"/>
-      <w:r>
-        <w:rPr>
-          <w:lang w:val="pl-PL"/>
-        </w:rPr>
-        <w:t>docx</w:t>
-      </w:r>
-      <w:proofErr w:type="spellEnd"/>
-      <w:r>
-        <w:rPr>
-          <w:lang w:val="pl-PL"/>
-        </w:rPr>
-        <w:t xml:space="preserve"> – Każdy dokument </w:t>
-      </w:r>
-      <w:proofErr w:type="spellStart"/>
-      <w:r>
-        <w:rPr>
-          <w:lang w:val="pl-PL"/>
-        </w:rPr>
-        <w:t>powinień</w:t>
-      </w:r>
-      <w:proofErr w:type="spellEnd"/>
-      <w:r>
-        <w:rPr>
-          <w:lang w:val="pl-PL"/>
-        </w:rPr>
-        <w:t xml:space="preserve"> umożliwiać edycję</w:t>
+        <w:t>.docx – Każdy dokument powinień umożliwiać edycję</w:t>
       </w:r>
     </w:p>
     <w:p>
@@ -5429,14 +4687,12 @@
           <w:lang w:val="pl-PL"/>
         </w:rPr>
       </w:pPr>
-      <w:proofErr w:type="spellStart"/>
       <w:r>
         <w:rPr>
           <w:lang w:val="pl-PL"/>
         </w:rPr>
         <w:t>Header</w:t>
       </w:r>
-      <w:proofErr w:type="spellEnd"/>
       <w:r>
         <w:rPr>
           <w:lang w:val="pl-PL"/>
@@ -5476,19 +4732,9 @@
           <w:numId w:val="16"/>
         </w:numPr>
       </w:pPr>
-      <w:proofErr w:type="spellStart"/>
-      <w:r>
-        <w:t>Spis</w:t>
-      </w:r>
-      <w:proofErr w:type="spellEnd"/>
-      <w:r>
-        <w:t xml:space="preserve"> </w:t>
-      </w:r>
-      <w:proofErr w:type="spellStart"/>
-      <w:r>
-        <w:t>treści</w:t>
-      </w:r>
-      <w:proofErr w:type="spellEnd"/>
+      <w:r>
+        <w:t>Spis treści</w:t>
+      </w:r>
     </w:p>
     <w:p>
       <w:pPr>
@@ -5516,27 +4762,9 @@
           <w:numId w:val="16"/>
         </w:numPr>
       </w:pPr>
-      <w:proofErr w:type="spellStart"/>
-      <w:r>
-        <w:t>Załączniki</w:t>
-      </w:r>
-      <w:proofErr w:type="spellEnd"/>
-      <w:r>
-        <w:t xml:space="preserve"> / </w:t>
-      </w:r>
-      <w:proofErr w:type="spellStart"/>
-      <w:r>
-        <w:t>schematy</w:t>
-      </w:r>
-      <w:proofErr w:type="spellEnd"/>
-      <w:r>
-        <w:t xml:space="preserve"> / </w:t>
-      </w:r>
-      <w:proofErr w:type="spellStart"/>
-      <w:r>
-        <w:t>linki</w:t>
-      </w:r>
-      <w:proofErr w:type="spellEnd"/>
+      <w:r>
+        <w:t>Załączniki / schematy / linki</w:t>
+      </w:r>
     </w:p>
     <w:p>
       <w:pPr>
@@ -5577,24 +4805,11 @@
       <w:pPr>
         <w:pStyle w:val="Tekst"/>
       </w:pPr>
-      <w:proofErr w:type="spellStart"/>
       <w:r>
         <w:t>W</w:t>
       </w:r>
       <w:r>
-        <w:t>ersjonowanie</w:t>
-      </w:r>
-      <w:proofErr w:type="spellEnd"/>
-      <w:r>
-        <w:t xml:space="preserve"> </w:t>
-      </w:r>
-      <w:proofErr w:type="spellStart"/>
-      <w:r>
-        <w:t>automatyczne</w:t>
-      </w:r>
-      <w:proofErr w:type="spellEnd"/>
-      <w:r>
-        <w:t xml:space="preserve"> w GitHub</w:t>
+        <w:t>ersjonowanie automatyczne w GitHub</w:t>
       </w:r>
       <w:r>
         <w:t>:</w:t>
@@ -5611,33 +4826,11 @@
           <w:lang w:val="pl-PL"/>
         </w:rPr>
       </w:pPr>
-      <w:proofErr w:type="spellStart"/>
-      <w:r>
-        <w:rPr>
-          <w:lang w:val="pl-PL"/>
-        </w:rPr>
-        <w:t>Branch</w:t>
-      </w:r>
-      <w:proofErr w:type="spellEnd"/>
-      <w:r>
-        <w:rPr>
-          <w:lang w:val="pl-PL"/>
-        </w:rPr>
-        <w:t xml:space="preserve"> </w:t>
-      </w:r>
-      <w:proofErr w:type="spellStart"/>
-      <w:r>
-        <w:rPr>
-          <w:lang w:val="pl-PL"/>
-        </w:rPr>
-        <w:t>main</w:t>
-      </w:r>
-      <w:proofErr w:type="spellEnd"/>
-      <w:r>
-        <w:rPr>
-          <w:lang w:val="pl-PL"/>
-        </w:rPr>
-        <w:t>: gotowe moduły, do</w:t>
+      <w:r>
+        <w:rPr>
+          <w:lang w:val="pl-PL"/>
+        </w:rPr>
+        <w:t>Branch main: gotowe moduły, do</w:t>
       </w:r>
       <w:r>
         <w:rPr>
@@ -5657,33 +4850,11 @@
           <w:lang w:val="pl-PL"/>
         </w:rPr>
       </w:pPr>
-      <w:proofErr w:type="spellStart"/>
-      <w:r>
-        <w:rPr>
-          <w:lang w:val="pl-PL"/>
-        </w:rPr>
-        <w:t>Branch</w:t>
-      </w:r>
-      <w:proofErr w:type="spellEnd"/>
-      <w:r>
-        <w:rPr>
-          <w:lang w:val="pl-PL"/>
-        </w:rPr>
-        <w:t xml:space="preserve"> </w:t>
-      </w:r>
-      <w:proofErr w:type="spellStart"/>
-      <w:r>
-        <w:rPr>
-          <w:lang w:val="pl-PL"/>
-        </w:rPr>
-        <w:t>dev</w:t>
-      </w:r>
-      <w:proofErr w:type="spellEnd"/>
-      <w:r>
-        <w:rPr>
-          <w:lang w:val="pl-PL"/>
-        </w:rPr>
-        <w:t>: wersje robocze, integracja funkcji</w:t>
+      <w:r>
+        <w:rPr>
+          <w:lang w:val="pl-PL"/>
+        </w:rPr>
+        <w:t>Branch dev: wersje robocze, integracja funkcji</w:t>
       </w:r>
     </w:p>
     <w:p>
@@ -5697,48 +4868,18 @@
           <w:lang w:val="pl-PL"/>
         </w:rPr>
       </w:pPr>
-      <w:proofErr w:type="spellStart"/>
-      <w:r>
-        <w:rPr>
-          <w:lang w:val="pl-PL"/>
-        </w:rPr>
-        <w:t>Pull</w:t>
-      </w:r>
-      <w:proofErr w:type="spellEnd"/>
-      <w:r>
-        <w:rPr>
-          <w:lang w:val="pl-PL"/>
-        </w:rPr>
-        <w:t xml:space="preserve"> </w:t>
-      </w:r>
-      <w:proofErr w:type="spellStart"/>
-      <w:r>
-        <w:rPr>
-          <w:lang w:val="pl-PL"/>
-        </w:rPr>
-        <w:t>requesty</w:t>
-      </w:r>
-      <w:proofErr w:type="spellEnd"/>
-      <w:r>
-        <w:rPr>
-          <w:lang w:val="pl-PL"/>
-        </w:rPr>
-        <w:t xml:space="preserve"> wymagane do scalenia</w:t>
-      </w:r>
-      <w:r>
-        <w:rPr>
-          <w:lang w:val="pl-PL"/>
-        </w:rPr>
-        <w:t xml:space="preserve"> zmian do </w:t>
-      </w:r>
-      <w:proofErr w:type="spellStart"/>
-      <w:r>
-        <w:rPr>
-          <w:lang w:val="pl-PL"/>
-        </w:rPr>
-        <w:t>main</w:t>
-      </w:r>
-      <w:proofErr w:type="spellEnd"/>
+      <w:r>
+        <w:rPr>
+          <w:lang w:val="pl-PL"/>
+        </w:rPr>
+        <w:t>Pull requesty wymagane do scalenia</w:t>
+      </w:r>
+      <w:r>
+        <w:rPr>
+          <w:lang w:val="pl-PL"/>
+        </w:rPr>
+        <w:t xml:space="preserve"> zmian do main</w:t>
+      </w:r>
     </w:p>
     <w:p>
       <w:pPr>
@@ -5751,19 +4892,11 @@
           <w:lang w:val="pl-PL"/>
         </w:rPr>
       </w:pPr>
-      <w:proofErr w:type="spellStart"/>
-      <w:r>
-        <w:rPr>
-          <w:lang w:val="pl-PL"/>
-        </w:rPr>
-        <w:t>Review</w:t>
-      </w:r>
-      <w:proofErr w:type="spellEnd"/>
-      <w:r>
-        <w:rPr>
-          <w:lang w:val="pl-PL"/>
-        </w:rPr>
-        <w:t xml:space="preserve"> przez inną osobę niż osoba wprowadzająca zmiany</w:t>
+      <w:r>
+        <w:rPr>
+          <w:lang w:val="pl-PL"/>
+        </w:rPr>
+        <w:t>Review przez inną osobę niż osoba wprowadzająca zmiany</w:t>
       </w:r>
     </w:p>
     <w:p>
@@ -5781,21 +4914,7 @@
         <w:rPr>
           <w:lang w:val="pl-PL"/>
         </w:rPr>
-        <w:t xml:space="preserve">Każda wersja gotowej aplikacji oznaczona </w:t>
-      </w:r>
-      <w:proofErr w:type="spellStart"/>
-      <w:r>
-        <w:rPr>
-          <w:lang w:val="pl-PL"/>
-        </w:rPr>
-        <w:t>tagiem</w:t>
-      </w:r>
-      <w:proofErr w:type="spellEnd"/>
-      <w:r>
-        <w:rPr>
-          <w:lang w:val="pl-PL"/>
-        </w:rPr>
-        <w:t xml:space="preserve"> (v.1.0 itd.)</w:t>
+        <w:t>Każda wersja gotowej aplikacji oznaczona tagiem (v.1.0 itd.)</w:t>
       </w:r>
     </w:p>
     <w:p>
@@ -5875,74 +4994,31 @@
                 <w:b/>
                 <w:bCs w:val="0"/>
               </w:rPr>
-              <w:t xml:space="preserve">Cel </w:t>
-            </w:r>
-            <w:proofErr w:type="spellStart"/>
-            <w:r>
+              <w:t>Cel użycia</w:t>
+            </w:r>
+          </w:p>
+        </w:tc>
+        <w:tc>
+          <w:tcPr>
+            <w:tcW w:w="3597" w:type="dxa"/>
+          </w:tcPr>
+          <w:p>
+            <w:pPr>
+              <w:pStyle w:val="Tekst"/>
+              <w:jc w:val="center"/>
               <w:rPr>
                 <w:b/>
                 <w:bCs w:val="0"/>
-              </w:rPr>
-              <w:t>użycia</w:t>
-            </w:r>
-            <w:proofErr w:type="spellEnd"/>
-          </w:p>
-        </w:tc>
-        <w:tc>
-          <w:tcPr>
-            <w:tcW w:w="3597" w:type="dxa"/>
-          </w:tcPr>
-          <w:p>
-            <w:pPr>
-              <w:pStyle w:val="Tekst"/>
-              <w:jc w:val="center"/>
+                <w:lang w:val="pl-PL"/>
+              </w:rPr>
+            </w:pPr>
+            <w:r>
               <w:rPr>
                 <w:b/>
                 <w:bCs w:val="0"/>
-                <w:lang w:val="pl-PL"/>
-              </w:rPr>
-            </w:pPr>
-            <w:proofErr w:type="spellStart"/>
-            <w:r>
-              <w:rPr>
-                <w:b/>
-                <w:bCs w:val="0"/>
-              </w:rPr>
-              <w:t>Uwagi</w:t>
-            </w:r>
-            <w:proofErr w:type="spellEnd"/>
-            <w:r>
-              <w:rPr>
-                <w:b/>
-                <w:bCs w:val="0"/>
-              </w:rPr>
-              <w:t xml:space="preserve"> / </w:t>
-            </w:r>
-            <w:proofErr w:type="spellStart"/>
-            <w:r>
-              <w:rPr>
-                <w:b/>
-                <w:bCs w:val="0"/>
-              </w:rPr>
-              <w:t>dodatkowe</w:t>
-            </w:r>
-            <w:proofErr w:type="spellEnd"/>
-            <w:r>
-              <w:rPr>
-                <w:b/>
-                <w:bCs w:val="0"/>
-              </w:rPr>
-              <w:t xml:space="preserve"> </w:t>
-            </w:r>
-            <w:proofErr w:type="spellStart"/>
-            <w:r>
-              <w:rPr>
-                <w:b/>
-                <w:bCs w:val="0"/>
-              </w:rPr>
-              <w:t>informacje</w:t>
-            </w:r>
-            <w:proofErr w:type="spellEnd"/>
+              </w:rPr>
+              <w:t>Uwagi / dodatkowe informacje</w:t>
+            </w:r>
           </w:p>
         </w:tc>
       </w:tr>
@@ -5962,16 +5038,8 @@
               <w:rPr>
                 <w:lang w:val="pl-PL"/>
               </w:rPr>
-              <w:t xml:space="preserve">Git / </w:t>
-            </w:r>
-            <w:proofErr w:type="spellStart"/>
-            <w:r>
-              <w:rPr>
-                <w:lang w:val="pl-PL"/>
-              </w:rPr>
-              <w:t>Github</w:t>
-            </w:r>
-            <w:proofErr w:type="spellEnd"/>
+              <w:t>Git / Github</w:t>
+            </w:r>
           </w:p>
         </w:tc>
         <w:tc>
@@ -6051,21 +5119,8 @@
                 <w:lang w:val="pl-PL"/>
               </w:rPr>
             </w:pPr>
-            <w:proofErr w:type="spellStart"/>
-            <w:r>
-              <w:t>Automatyzacja</w:t>
-            </w:r>
-            <w:proofErr w:type="spellEnd"/>
-            <w:r>
-              <w:t xml:space="preserve"> </w:t>
-            </w:r>
-            <w:proofErr w:type="spellStart"/>
-            <w:r>
-              <w:t>procesów</w:t>
-            </w:r>
-            <w:proofErr w:type="spellEnd"/>
-            <w:r>
-              <w:t xml:space="preserve"> CI/CD</w:t>
+            <w:r>
+              <w:t>Automatyzacja procesów CI/CD</w:t>
             </w:r>
           </w:p>
         </w:tc>
@@ -6095,14 +5150,12 @@
                 <w:lang w:val="pl-PL"/>
               </w:rPr>
             </w:pPr>
-            <w:proofErr w:type="spellStart"/>
             <w:r>
               <w:rPr>
                 <w:lang w:val="pl-PL"/>
               </w:rPr>
               <w:t>Discord</w:t>
             </w:r>
-            <w:proofErr w:type="spellEnd"/>
           </w:p>
         </w:tc>
         <w:tc>
@@ -6120,13 +5173,13 @@
               <w:rPr>
                 <w:lang w:val="pl-PL"/>
               </w:rPr>
-              <w:t xml:space="preserve">Komunikacja zespołu, spotkania, </w:t>
-            </w:r>
-            <w:r>
-              <w:rPr>
-                <w:lang w:val="pl-PL"/>
-              </w:rPr>
-              <w:t>zadania, organizacja</w:t>
+              <w:t>Komunikacja zespołu, spotkania</w:t>
+            </w:r>
+            <w:r>
+              <w:rPr>
+                <w:lang w:val="pl-PL"/>
+              </w:rPr>
+              <w:t>, organizacja</w:t>
             </w:r>
           </w:p>
         </w:tc>
@@ -6166,7 +5219,7 @@
               <w:rPr>
                 <w:lang w:val="pl-PL"/>
               </w:rPr>
-              <w:t>Word</w:t>
+              <w:t>Github issues</w:t>
             </w:r>
           </w:p>
         </w:tc>
@@ -6185,7 +5238,7 @@
               <w:rPr>
                 <w:lang w:val="pl-PL"/>
               </w:rPr>
-              <w:t>Tworzenie dokumentacji projektowej, raportów, prezentacji</w:t>
+              <w:t>Backlog/zadania</w:t>
             </w:r>
           </w:p>
         </w:tc>
@@ -6215,14 +5268,12 @@
                 <w:lang w:val="pl-PL"/>
               </w:rPr>
             </w:pPr>
-            <w:proofErr w:type="spellStart"/>
-            <w:r>
-              <w:rPr>
-                <w:lang w:val="pl-PL"/>
-              </w:rPr>
-              <w:t>Figma</w:t>
-            </w:r>
-            <w:proofErr w:type="spellEnd"/>
+            <w:r>
+              <w:rPr>
+                <w:lang w:val="pl-PL"/>
+              </w:rPr>
+              <w:t>Word</w:t>
+            </w:r>
           </w:p>
         </w:tc>
         <w:tc>
@@ -6240,7 +5291,7 @@
               <w:rPr>
                 <w:lang w:val="pl-PL"/>
               </w:rPr>
-              <w:t>Projektowanie UI/UX i prototypowanie interfejsu</w:t>
+              <w:t>Tworzenie dokumentacji projektowej, raportów, prezentacji</w:t>
             </w:r>
           </w:p>
         </w:tc>
@@ -6274,7 +5325,7 @@
               <w:rPr>
                 <w:lang w:val="pl-PL"/>
               </w:rPr>
-              <w:t>Enterprise Architect</w:t>
+              <w:t>Figma</w:t>
             </w:r>
           </w:p>
         </w:tc>
@@ -6289,35 +5340,12 @@
                 <w:lang w:val="pl-PL"/>
               </w:rPr>
             </w:pPr>
-            <w:proofErr w:type="spellStart"/>
-            <w:r>
-              <w:t>Modelowanie</w:t>
-            </w:r>
-            <w:proofErr w:type="spellEnd"/>
-            <w:r>
-              <w:t xml:space="preserve"> </w:t>
-            </w:r>
-            <w:proofErr w:type="spellStart"/>
-            <w:r>
-              <w:t>systemu</w:t>
-            </w:r>
-            <w:proofErr w:type="spellEnd"/>
-            <w:r>
-              <w:t xml:space="preserve"> </w:t>
-            </w:r>
-            <w:proofErr w:type="spellStart"/>
-            <w:r>
-              <w:t>i</w:t>
-            </w:r>
-            <w:proofErr w:type="spellEnd"/>
-            <w:r>
-              <w:t xml:space="preserve"> </w:t>
-            </w:r>
-            <w:proofErr w:type="spellStart"/>
-            <w:r>
-              <w:t>procesów</w:t>
-            </w:r>
-            <w:proofErr w:type="spellEnd"/>
+            <w:r>
+              <w:rPr>
+                <w:lang w:val="pl-PL"/>
+              </w:rPr>
+              <w:t>Projektowanie UI/UX i prototypowanie interfejsu</w:t>
+            </w:r>
           </w:p>
         </w:tc>
         <w:tc>
@@ -6331,12 +5359,6 @@
                 <w:lang w:val="pl-PL"/>
               </w:rPr>
             </w:pPr>
-            <w:r>
-              <w:rPr>
-                <w:lang w:val="pl-PL"/>
-              </w:rPr>
-              <w:t>Diagramy UML</w:t>
-            </w:r>
           </w:p>
         </w:tc>
       </w:tr>
@@ -6352,42 +5374,12 @@
                 <w:lang w:val="pl-PL"/>
               </w:rPr>
             </w:pPr>
-            <w:proofErr w:type="spellStart"/>
-            <w:r>
-              <w:rPr>
-                <w:lang w:val="pl-PL"/>
-              </w:rPr>
-              <w:t>Python</w:t>
-            </w:r>
-            <w:proofErr w:type="spellEnd"/>
-            <w:r>
-              <w:rPr>
-                <w:lang w:val="pl-PL"/>
-              </w:rPr>
-              <w:t xml:space="preserve"> + </w:t>
-            </w:r>
-            <w:proofErr w:type="spellStart"/>
-            <w:r>
-              <w:rPr>
-                <w:lang w:val="pl-PL"/>
-              </w:rPr>
-              <w:t>PyTorch</w:t>
-            </w:r>
-            <w:proofErr w:type="spellEnd"/>
-            <w:r>
-              <w:rPr>
-                <w:lang w:val="pl-PL"/>
-              </w:rPr>
-              <w:t xml:space="preserve"> + </w:t>
-            </w:r>
-            <w:proofErr w:type="spellStart"/>
-            <w:r>
-              <w:rPr>
-                <w:lang w:val="pl-PL"/>
-              </w:rPr>
-              <w:t>PyTest</w:t>
-            </w:r>
-            <w:proofErr w:type="spellEnd"/>
+            <w:r>
+              <w:rPr>
+                <w:lang w:val="pl-PL"/>
+              </w:rPr>
+              <w:t>Enterprise Architect</w:t>
+            </w:r>
           </w:p>
         </w:tc>
         <w:tc>
@@ -6402,10 +5394,7 @@
               </w:rPr>
             </w:pPr>
             <w:r>
-              <w:rPr>
-                <w:lang w:val="pl-PL"/>
-              </w:rPr>
-              <w:t>Implementacja i testowanie modeli AI / NLP</w:t>
+              <w:t>Modelowanie systemu i procesów</w:t>
             </w:r>
           </w:p>
         </w:tc>
@@ -6420,6 +5409,12 @@
                 <w:lang w:val="pl-PL"/>
               </w:rPr>
             </w:pPr>
+            <w:r>
+              <w:rPr>
+                <w:lang w:val="pl-PL"/>
+              </w:rPr>
+              <w:t>Diagramy UML</w:t>
+            </w:r>
           </w:p>
         </w:tc>
       </w:tr>
@@ -6435,28 +5430,12 @@
                 <w:lang w:val="pl-PL"/>
               </w:rPr>
             </w:pPr>
-            <w:proofErr w:type="spellStart"/>
-            <w:r>
-              <w:rPr>
-                <w:lang w:val="pl-PL"/>
-              </w:rPr>
-              <w:t>Flutter</w:t>
-            </w:r>
-            <w:proofErr w:type="spellEnd"/>
-            <w:r>
-              <w:rPr>
-                <w:lang w:val="pl-PL"/>
-              </w:rPr>
-              <w:t xml:space="preserve"> + </w:t>
-            </w:r>
-            <w:proofErr w:type="spellStart"/>
-            <w:r>
-              <w:rPr>
-                <w:lang w:val="pl-PL"/>
-              </w:rPr>
-              <w:t>Dart</w:t>
-            </w:r>
-            <w:proofErr w:type="spellEnd"/>
+            <w:r>
+              <w:rPr>
+                <w:lang w:val="pl-PL"/>
+              </w:rPr>
+              <w:t>Python + PyTorch + PyTest</w:t>
+            </w:r>
           </w:p>
         </w:tc>
         <w:tc>
@@ -6474,7 +5453,7 @@
               <w:rPr>
                 <w:lang w:val="pl-PL"/>
               </w:rPr>
-              <w:t>Wytwarzanie aplikacji mobilnej (Android/iOS)</w:t>
+              <w:t>Implementacja i testowanie modeli AI / NLP</w:t>
             </w:r>
           </w:p>
         </w:tc>
@@ -6489,28 +5468,6 @@
                 <w:lang w:val="pl-PL"/>
               </w:rPr>
             </w:pPr>
-            <w:r>
-              <w:rPr>
-                <w:lang w:val="pl-PL"/>
-              </w:rPr>
-              <w:t>T</w:t>
-            </w:r>
-            <w:proofErr w:type="spellStart"/>
-            <w:r>
-              <w:t>worzenie</w:t>
-            </w:r>
-            <w:proofErr w:type="spellEnd"/>
-            <w:r>
-              <w:t xml:space="preserve"> </w:t>
-            </w:r>
-            <w:proofErr w:type="spellStart"/>
-            <w:r>
-              <w:t>aplikacji</w:t>
-            </w:r>
-            <w:proofErr w:type="spellEnd"/>
-            <w:r>
-              <w:t xml:space="preserve"> cross-platform</w:t>
-            </w:r>
           </w:p>
         </w:tc>
       </w:tr>
@@ -6526,14 +5483,74 @@
                 <w:lang w:val="pl-PL"/>
               </w:rPr>
             </w:pPr>
-            <w:proofErr w:type="spellStart"/>
+            <w:r>
+              <w:rPr>
+                <w:lang w:val="pl-PL"/>
+              </w:rPr>
+              <w:t>Flutter + Dart</w:t>
+            </w:r>
+          </w:p>
+        </w:tc>
+        <w:tc>
+          <w:tcPr>
+            <w:tcW w:w="3597" w:type="dxa"/>
+          </w:tcPr>
+          <w:p>
+            <w:pPr>
+              <w:pStyle w:val="Tekst"/>
+              <w:rPr>
+                <w:lang w:val="pl-PL"/>
+              </w:rPr>
+            </w:pPr>
+            <w:r>
+              <w:rPr>
+                <w:lang w:val="pl-PL"/>
+              </w:rPr>
+              <w:t>Wytwarzanie aplikacji mobilnej (Android/iOS)</w:t>
+            </w:r>
+          </w:p>
+        </w:tc>
+        <w:tc>
+          <w:tcPr>
+            <w:tcW w:w="3597" w:type="dxa"/>
+          </w:tcPr>
+          <w:p>
+            <w:pPr>
+              <w:pStyle w:val="Tekst"/>
+              <w:rPr>
+                <w:lang w:val="pl-PL"/>
+              </w:rPr>
+            </w:pPr>
+            <w:r>
+              <w:rPr>
+                <w:lang w:val="pl-PL"/>
+              </w:rPr>
+              <w:t>T</w:t>
+            </w:r>
+            <w:r>
+              <w:t>worzenie aplikacji cross-platform</w:t>
+            </w:r>
+          </w:p>
+        </w:tc>
+      </w:tr>
+      <w:tr>
+        <w:tc>
+          <w:tcPr>
+            <w:tcW w:w="3596" w:type="dxa"/>
+          </w:tcPr>
+          <w:p>
+            <w:pPr>
+              <w:pStyle w:val="Tekst"/>
+              <w:rPr>
+                <w:lang w:val="pl-PL"/>
+              </w:rPr>
+            </w:pPr>
             <w:r>
               <w:rPr>
                 <w:lang w:val="pl-PL"/>
               </w:rPr>
               <w:t>PostgresSQL</w:t>
             </w:r>
-            <w:proofErr w:type="spellEnd"/>
           </w:p>
         </w:tc>
         <w:tc>
@@ -6547,27 +5564,9 @@
                 <w:lang w:val="pl-PL"/>
               </w:rPr>
             </w:pPr>
-            <w:proofErr w:type="spellStart"/>
-            <w:r>
-              <w:t>Przechowywanie</w:t>
-            </w:r>
-            <w:proofErr w:type="spellEnd"/>
-            <w:r>
-              <w:t xml:space="preserve"> </w:t>
-            </w:r>
-            <w:proofErr w:type="spellStart"/>
-            <w:r>
-              <w:t>danych</w:t>
-            </w:r>
-            <w:proofErr w:type="spellEnd"/>
-            <w:r>
-              <w:t xml:space="preserve"> </w:t>
-            </w:r>
-            <w:proofErr w:type="spellStart"/>
-            <w:r>
-              <w:t>aplikacji</w:t>
-            </w:r>
-            <w:proofErr w:type="spellEnd"/>
+            <w:r>
+              <w:t>Przechowywanie danych aplikacji</w:t>
+            </w:r>
           </w:p>
         </w:tc>
         <w:tc>
@@ -10356,6 +9355,7 @@
   <w:style w:type="character" w:default="1" w:styleId="Domylnaczcionkaakapitu">
     <w:name w:val="Default Paragraph Font"/>
     <w:uiPriority w:val="1"/>
+    <w:semiHidden/>
     <w:unhideWhenUsed/>
   </w:style>
   <w:style w:type="table" w:default="1" w:styleId="Standardowy">

</xml_diff>